<commit_message>
chore: store FX archives under data/history with 90-day retention
Move dated CSV/JSON into data/history/, auto-prune files older than 90 days, and update docs plus exports to match.

Co-authored-by: Cursor <cursoragent@cursor.com>
</commit_message>
<xml_diff>
--- a/docs/word/TECHNICAL.en.docx
+++ b/docs/word/TECHNICAL.en.docx
@@ -401,7 +401,9 @@
         <w:br/>
         <w:t>│   ├── bot-xrt-latest.meta.txt          # checksum / fetch time</w:t>
         <w:br/>
-        <w:t>│   └── bot-xrt-YYYY-MM-DD.*             # daily archive</w:t>
+        <w:t>│   └── history/                         # dated archives (last 90 days only)</w:t>
+        <w:br/>
+        <w:t>│       └── bot-xrt-YYYY-MM-DD.*</w:t>
         <w:br/>
         <w:t>├── docs/                                # documentation</w:t>
         <w:br/>
@@ -633,7 +635,39 @@
                 <w:rFonts w:ascii="Calibri" w:hAnsi="Calibri" w:eastAsia="Microsoft JhengHei"/>
                 <w:sz w:val="20"/>
               </w:rPr>
-              <w:t>Skip dated bot-xrt-YYYY-MM-DD.* archives</w:t>
+              <w:t>Skip dated archives under data/history/</w:t>
+            </w:r>
+          </w:p>
+        </w:tc>
+      </w:tr>
+      <w:tr>
+        <w:tc>
+          <w:tcPr>
+            <w:tcW w:type="dxa" w:w="4824"/>
+          </w:tcPr>
+          <w:p>
+            <w:r/>
+            <w:r>
+              <w:rPr>
+                <w:rFonts w:ascii="Calibri" w:hAnsi="Calibri" w:eastAsia="Microsoft JhengHei"/>
+                <w:sz w:val="20"/>
+              </w:rPr>
+              <w:t>--retention-days</w:t>
+            </w:r>
+          </w:p>
+        </w:tc>
+        <w:tc>
+          <w:tcPr>
+            <w:tcW w:type="dxa" w:w="4824"/>
+          </w:tcPr>
+          <w:p>
+            <w:r/>
+            <w:r>
+              <w:rPr>
+                <w:rFonts w:ascii="Calibri" w:hAnsi="Calibri" w:eastAsia="Microsoft JhengHei"/>
+                <w:sz w:val="20"/>
+              </w:rPr>
+              <w:t>Keep only the latest N days in history (default 90)</w:t>
             </w:r>
           </w:p>
         </w:tc>
@@ -676,7 +710,146 @@
         <w:br/>
         <w:t>changed=true</w:t>
         <w:br/>
-        <w:t>archive_json=.../data/bot-xrt-2026-08-11.json</w:t>
+        <w:t>archive_json=.../data/history/bot-xrt-2026-08-11.json</w:t>
+        <w:br/>
+        <w:t>retention_days=90</w:t>
+        <w:br/>
+        <w:t>history_migrated=0</w:t>
+        <w:br/>
+        <w:t>history_pruned=0</w:t>
+      </w:r>
+    </w:p>
+    <w:p>
+      <w:r>
+        <w:rPr>
+          <w:rFonts w:ascii="Calibri" w:hAnsi="Calibri" w:eastAsia="Microsoft JhengHei"/>
+          <w:sz w:val="22"/>
+        </w:rPr>
+        <w:t>History policy:</w:t>
+      </w:r>
+    </w:p>
+    <w:p>
+      <w:pPr>
+        <w:pStyle w:val="ListBullet"/>
+      </w:pPr>
+      <w:r>
+        <w:rPr>
+          <w:rFonts w:ascii="Calibri" w:hAnsi="Calibri" w:eastAsia="Microsoft JhengHei"/>
+          <w:sz w:val="22"/>
+        </w:rPr>
+        <w:t xml:space="preserve">Directory: </w:t>
+      </w:r>
+      <w:r>
+        <w:rPr>
+          <w:rFonts w:ascii="Consolas" w:hAnsi="Consolas" w:eastAsia="Consolas"/>
+          <w:color w:val="333333"/>
+          <w:sz w:val="22"/>
+        </w:rPr>
+        <w:t>data/history/</w:t>
+      </w:r>
+    </w:p>
+    <w:p>
+      <w:pPr>
+        <w:pStyle w:val="ListBullet"/>
+      </w:pPr>
+      <w:r>
+        <w:rPr>
+          <w:rFonts w:ascii="Calibri" w:hAnsi="Calibri" w:eastAsia="Microsoft JhengHei"/>
+          <w:sz w:val="22"/>
+        </w:rPr>
+        <w:t xml:space="preserve">Filenames: </w:t>
+      </w:r>
+      <w:r>
+        <w:rPr>
+          <w:rFonts w:ascii="Consolas" w:hAnsi="Consolas" w:eastAsia="Consolas"/>
+          <w:color w:val="333333"/>
+          <w:sz w:val="22"/>
+        </w:rPr>
+        <w:t>bot-xrt-YYYY-MM-DD.csv</w:t>
+      </w:r>
+      <w:r>
+        <w:rPr>
+          <w:rFonts w:ascii="Calibri" w:hAnsi="Calibri" w:eastAsia="Microsoft JhengHei"/>
+          <w:sz w:val="22"/>
+        </w:rPr>
+        <w:t xml:space="preserve"> / </w:t>
+      </w:r>
+      <w:r>
+        <w:rPr>
+          <w:rFonts w:ascii="Consolas" w:hAnsi="Consolas" w:eastAsia="Consolas"/>
+          <w:color w:val="333333"/>
+          <w:sz w:val="22"/>
+        </w:rPr>
+        <w:t>.json</w:t>
+      </w:r>
+    </w:p>
+    <w:p>
+      <w:pPr>
+        <w:pStyle w:val="ListBullet"/>
+      </w:pPr>
+      <w:r>
+        <w:rPr>
+          <w:rFonts w:ascii="Calibri" w:hAnsi="Calibri" w:eastAsia="Microsoft JhengHei"/>
+          <w:sz w:val="22"/>
+        </w:rPr>
+        <w:t xml:space="preserve">Default retention: </w:t>
+      </w:r>
+      <w:r>
+        <w:rPr>
+          <w:rFonts w:ascii="Calibri" w:hAnsi="Calibri" w:eastAsia="Microsoft JhengHei"/>
+          <w:b/>
+          <w:sz w:val="22"/>
+        </w:rPr>
+        <w:t>90</w:t>
+      </w:r>
+      <w:r>
+        <w:rPr>
+          <w:rFonts w:ascii="Calibri" w:hAnsi="Calibri" w:eastAsia="Microsoft JhengHei"/>
+          <w:sz w:val="22"/>
+        </w:rPr>
+        <w:t xml:space="preserve"> days (older files are deleted automatically)</w:t>
+      </w:r>
+    </w:p>
+    <w:p>
+      <w:pPr>
+        <w:pStyle w:val="ListBullet"/>
+      </w:pPr>
+      <w:r>
+        <w:rPr>
+          <w:rFonts w:ascii="Calibri" w:hAnsi="Calibri" w:eastAsia="Microsoft JhengHei"/>
+          <w:sz w:val="22"/>
+        </w:rPr>
+        <w:t xml:space="preserve">Legacy dated files left under </w:t>
+      </w:r>
+      <w:r>
+        <w:rPr>
+          <w:rFonts w:ascii="Consolas" w:hAnsi="Consolas" w:eastAsia="Consolas"/>
+          <w:color w:val="333333"/>
+          <w:sz w:val="22"/>
+        </w:rPr>
+        <w:t>data/</w:t>
+      </w:r>
+      <w:r>
+        <w:rPr>
+          <w:rFonts w:ascii="Calibri" w:hAnsi="Calibri" w:eastAsia="Microsoft JhengHei"/>
+          <w:sz w:val="22"/>
+        </w:rPr>
+        <w:t xml:space="preserve"> are moved into </w:t>
+      </w:r>
+      <w:r>
+        <w:rPr>
+          <w:rFonts w:ascii="Consolas" w:hAnsi="Consolas" w:eastAsia="Consolas"/>
+          <w:color w:val="333333"/>
+          <w:sz w:val="22"/>
+        </w:rPr>
+        <w:t>history/</w:t>
+      </w:r>
+      <w:r>
+        <w:rPr>
+          <w:rFonts w:ascii="Calibri" w:hAnsi="Calibri" w:eastAsia="Microsoft JhengHei"/>
+          <w:sz w:val="22"/>
+        </w:rPr>
+        <w:t xml:space="preserve"> on each run</w:t>
       </w:r>
     </w:p>
     <w:p>
@@ -1013,7 +1186,7 @@
                 <w:rFonts w:ascii="Calibri" w:hAnsi="Calibri" w:eastAsia="Microsoft JhengHei"/>
                 <w:sz w:val="20"/>
               </w:rPr>
-              <w:t>Write CSV/JSON/meta/archives</w:t>
+              <w:t>Write CSV/JSON/meta/history</w:t>
             </w:r>
           </w:p>
         </w:tc>
@@ -1029,6 +1202,100 @@
                 <w:sz w:val="20"/>
               </w:rPr>
               <w:t>Filenames, archive policy, change detection</w:t>
+            </w:r>
+          </w:p>
+        </w:tc>
+      </w:tr>
+      <w:tr>
+        <w:tc>
+          <w:tcPr>
+            <w:tcW w:type="dxa" w:w="3216"/>
+          </w:tcPr>
+          <w:p>
+            <w:r/>
+            <w:r>
+              <w:rPr>
+                <w:rFonts w:ascii="Calibri" w:hAnsi="Calibri" w:eastAsia="Microsoft JhengHei"/>
+                <w:sz w:val="20"/>
+              </w:rPr>
+              <w:t>migrate_legacy_archives()</w:t>
+            </w:r>
+          </w:p>
+        </w:tc>
+        <w:tc>
+          <w:tcPr>
+            <w:tcW w:type="dxa" w:w="3216"/>
+          </w:tcPr>
+          <w:p>
+            <w:r/>
+            <w:r>
+              <w:rPr>
+                <w:rFonts w:ascii="Calibri" w:hAnsi="Calibri" w:eastAsia="Microsoft JhengHei"/>
+                <w:sz w:val="20"/>
+              </w:rPr>
+              <w:t>Move old dated files into history/</w:t>
+            </w:r>
+          </w:p>
+        </w:tc>
+        <w:tc>
+          <w:tcPr>
+            <w:tcW w:type="dxa" w:w="3216"/>
+          </w:tcPr>
+          <w:p>
+            <w:r/>
+            <w:r>
+              <w:rPr>
+                <w:rFonts w:ascii="Calibri" w:hAnsi="Calibri" w:eastAsia="Microsoft JhengHei"/>
+                <w:sz w:val="20"/>
+              </w:rPr>
+              <w:t>Compatibility with previous layout</w:t>
+            </w:r>
+          </w:p>
+        </w:tc>
+      </w:tr>
+      <w:tr>
+        <w:tc>
+          <w:tcPr>
+            <w:tcW w:type="dxa" w:w="3216"/>
+          </w:tcPr>
+          <w:p>
+            <w:r/>
+            <w:r>
+              <w:rPr>
+                <w:rFonts w:ascii="Calibri" w:hAnsi="Calibri" w:eastAsia="Microsoft JhengHei"/>
+                <w:sz w:val="20"/>
+              </w:rPr>
+              <w:t>prune_history()</w:t>
+            </w:r>
+          </w:p>
+        </w:tc>
+        <w:tc>
+          <w:tcPr>
+            <w:tcW w:type="dxa" w:w="3216"/>
+          </w:tcPr>
+          <w:p>
+            <w:r/>
+            <w:r>
+              <w:rPr>
+                <w:rFonts w:ascii="Calibri" w:hAnsi="Calibri" w:eastAsia="Microsoft JhengHei"/>
+                <w:sz w:val="20"/>
+              </w:rPr>
+              <w:t>Delete files older than retention</w:t>
+            </w:r>
+          </w:p>
+        </w:tc>
+        <w:tc>
+          <w:tcPr>
+            <w:tcW w:type="dxa" w:w="3216"/>
+          </w:tcPr>
+          <w:p>
+            <w:r/>
+            <w:r>
+              <w:rPr>
+                <w:rFonts w:ascii="Calibri" w:hAnsi="Calibri" w:eastAsia="Microsoft JhengHei"/>
+                <w:sz w:val="20"/>
+              </w:rPr>
+              <w:t>Retention policy changes</w:t>
             </w:r>
           </w:p>
         </w:tc>

</xml_diff>